<commit_message>
fix: adjust markdown list formatting and update DOCX/PDF reports
</commit_message>
<xml_diff>
--- a/My_Compiler_Project_Report.docx
+++ b/My_Compiler_Project_Report.docx
@@ -51,53 +51,69 @@
         </w:rPr>
         <w:t xml:space="preserve">إعداد وتقديم الطلاب:</w:t>
       </w:r>
-      <w:r>
-        <w:rPr>
-          <w:rtl/>
-        </w:rPr>
-        <w:t xml:space="preserve"> </w:t>
-      </w:r>
-      <w:r>
-        <w:rPr>
-          <w:rtl/>
-        </w:rPr>
-        <w:t xml:space="preserve">- عمر جمال كحيل</w:t>
-      </w:r>
-      <w:r>
-        <w:rPr>
-          <w:rtl/>
-        </w:rPr>
-        <w:t xml:space="preserve"> </w:t>
-      </w:r>
-      <w:r>
-        <w:rPr>
-          <w:rtl/>
-        </w:rPr>
-        <w:t xml:space="preserve">- سيف الدين خالد كناني</w:t>
-      </w:r>
-      <w:r>
-        <w:rPr>
-          <w:rtl/>
-        </w:rPr>
-        <w:t xml:space="preserve"> </w:t>
-      </w:r>
-      <w:r>
-        <w:rPr>
-          <w:rtl/>
-        </w:rPr>
-        <w:t xml:space="preserve">- عبد الرحمن مازن السيد احمد</w:t>
-      </w:r>
-      <w:r>
-        <w:rPr>
-          <w:rtl/>
-        </w:rPr>
-        <w:t xml:space="preserve"> </w:t>
-      </w:r>
-      <w:r>
-        <w:rPr>
-          <w:rtl/>
-        </w:rPr>
-        <w:t xml:space="preserve">- مهاب تيسير شهاب</w:t>
+    </w:p>
+    <w:p>
+      <w:pPr>
+        <w:numPr>
+          <w:ilvl w:val="0"/>
+          <w:numId w:val="1001"/>
+        </w:numPr>
+        <w:pStyle w:val="Compact"/>
+        <w:bidi/>
+      </w:pPr>
+      <w:r>
+        <w:rPr>
+          <w:rtl/>
+        </w:rPr>
+        <w:t xml:space="preserve">عمر جمال كحيل</w:t>
+      </w:r>
+    </w:p>
+    <w:p>
+      <w:pPr>
+        <w:numPr>
+          <w:ilvl w:val="0"/>
+          <w:numId w:val="1001"/>
+        </w:numPr>
+        <w:pStyle w:val="Compact"/>
+        <w:bidi/>
+      </w:pPr>
+      <w:r>
+        <w:rPr>
+          <w:rtl/>
+        </w:rPr>
+        <w:t xml:space="preserve">سيف الدين خالد كناني</w:t>
+      </w:r>
+    </w:p>
+    <w:p>
+      <w:pPr>
+        <w:numPr>
+          <w:ilvl w:val="0"/>
+          <w:numId w:val="1001"/>
+        </w:numPr>
+        <w:pStyle w:val="Compact"/>
+        <w:bidi/>
+      </w:pPr>
+      <w:r>
+        <w:rPr>
+          <w:rtl/>
+        </w:rPr>
+        <w:t xml:space="preserve">عبد الرحمن مازن السيد احمد</w:t>
+      </w:r>
+    </w:p>
+    <w:p>
+      <w:pPr>
+        <w:numPr>
+          <w:ilvl w:val="0"/>
+          <w:numId w:val="1001"/>
+        </w:numPr>
+        <w:pStyle w:val="Compact"/>
+        <w:bidi/>
+      </w:pPr>
+      <w:r>
+        <w:rPr>
+          <w:rtl/>
+        </w:rPr>
+        <w:t xml:space="preserve">مهاب تيسير شهاب</w:t>
       </w:r>
     </w:p>
     <w:p>
@@ -132,24 +148,16 @@
         </w:rPr>
         <w:t xml:space="preserve">في هذا المشروع، قمنا ببناء مترجم (Compiler) متكامل يجمع بين بيئتين أساسيتين في عالم تطوير الويب الحديث:</w:t>
       </w:r>
-      <w:r>
-        <w:rPr>
-          <w:rtl/>
-        </w:rPr>
-        <w:t xml:space="preserve"> </w:t>
-      </w:r>
-      <w:r>
-        <w:rPr>
-          <w:rtl/>
-        </w:rPr>
-        <w:t xml:space="preserve">1.</w:t>
-      </w:r>
-      <w:r>
-        <w:rPr>
-          <w:rtl/>
-        </w:rPr>
-        <w:t xml:space="preserve"> </w:t>
-      </w:r>
+    </w:p>
+    <w:p>
+      <w:pPr>
+        <w:numPr>
+          <w:ilvl w:val="0"/>
+          <w:numId w:val="1002"/>
+        </w:numPr>
+        <w:pStyle w:val="Compact"/>
+        <w:bidi/>
+      </w:pPr>
       <w:r>
         <w:rPr>
           <w:rtl/>
@@ -170,24 +178,16 @@
         </w:rPr>
         <w:t xml:space="preserve">لكتابة منطق النهاية الخلفية (Backend) وتعريف المتغيرات ومسارات الصفحات (Routes).</w:t>
       </w:r>
-      <w:r>
-        <w:rPr>
-          <w:rtl/>
-        </w:rPr>
-        <w:t xml:space="preserve"> </w:t>
-      </w:r>
-      <w:r>
-        <w:rPr>
-          <w:rtl/>
-        </w:rPr>
-        <w:t xml:space="preserve">2.</w:t>
-      </w:r>
-      <w:r>
-        <w:rPr>
-          <w:rtl/>
-        </w:rPr>
-        <w:t xml:space="preserve"> </w:t>
-      </w:r>
+    </w:p>
+    <w:p>
+      <w:pPr>
+        <w:numPr>
+          <w:ilvl w:val="0"/>
+          <w:numId w:val="1002"/>
+        </w:numPr>
+        <w:pStyle w:val="Compact"/>
+        <w:bidi/>
+      </w:pPr>
       <w:r>
         <w:rPr>
           <w:rtl/>
@@ -219,53 +219,69 @@
         </w:rPr>
         <w:t xml:space="preserve">الهدف الأساسي من المشروع هو محاكاة عمل إطار Flask الحقيقي، حيث يمر الكود بعدة مراحل:</w:t>
       </w:r>
-      <w:r>
-        <w:rPr>
-          <w:rtl/>
-        </w:rPr>
-        <w:t xml:space="preserve"> </w:t>
-      </w:r>
-      <w:r>
-        <w:rPr>
-          <w:rtl/>
-        </w:rPr>
-        <w:t xml:space="preserve">1. تحليل كود Python وبناء شجرته النحوية.</w:t>
-      </w:r>
-      <w:r>
-        <w:rPr>
-          <w:rtl/>
-        </w:rPr>
-        <w:t xml:space="preserve"> </w:t>
-      </w:r>
-      <w:r>
-        <w:rPr>
-          <w:rtl/>
-        </w:rPr>
-        <w:t xml:space="preserve">2. تحليل قوالب Jinja2 وبناء شجرتها النحوية.</w:t>
-      </w:r>
-      <w:r>
-        <w:rPr>
-          <w:rtl/>
-        </w:rPr>
-        <w:t xml:space="preserve"> </w:t>
-      </w:r>
-      <w:r>
-        <w:rPr>
-          <w:rtl/>
-        </w:rPr>
-        <w:t xml:space="preserve">3. استخراج البيانات الوهمية (Mock Data) والتحقق من صحة الكود دلالياً (Semantic Analysis).</w:t>
-      </w:r>
-      <w:r>
-        <w:rPr>
-          <w:rtl/>
-        </w:rPr>
-        <w:t xml:space="preserve"> </w:t>
-      </w:r>
-      <w:r>
-        <w:rPr>
-          <w:rtl/>
-        </w:rPr>
-        <w:t xml:space="preserve">4. ترجمة كل هذا وتوليد كود HTML نقي وربطه بالبيانات لعرضه للمستخدم النهائي.</w:t>
+    </w:p>
+    <w:p>
+      <w:pPr>
+        <w:numPr>
+          <w:ilvl w:val="0"/>
+          <w:numId w:val="1003"/>
+        </w:numPr>
+        <w:pStyle w:val="Compact"/>
+        <w:bidi/>
+      </w:pPr>
+      <w:r>
+        <w:rPr>
+          <w:rtl/>
+        </w:rPr>
+        <w:t xml:space="preserve">تحليل كود Python وبناء شجرته النحوية.</w:t>
+      </w:r>
+    </w:p>
+    <w:p>
+      <w:pPr>
+        <w:numPr>
+          <w:ilvl w:val="0"/>
+          <w:numId w:val="1003"/>
+        </w:numPr>
+        <w:pStyle w:val="Compact"/>
+        <w:bidi/>
+      </w:pPr>
+      <w:r>
+        <w:rPr>
+          <w:rtl/>
+        </w:rPr>
+        <w:t xml:space="preserve">تحليل قوالب Jinja2 وبناء شجرتها النحوية.</w:t>
+      </w:r>
+    </w:p>
+    <w:p>
+      <w:pPr>
+        <w:numPr>
+          <w:ilvl w:val="0"/>
+          <w:numId w:val="1003"/>
+        </w:numPr>
+        <w:pStyle w:val="Compact"/>
+        <w:bidi/>
+      </w:pPr>
+      <w:r>
+        <w:rPr>
+          <w:rtl/>
+        </w:rPr>
+        <w:t xml:space="preserve">استخراج البيانات الوهمية (Mock Data) والتحقق من صحة الكود دلالياً (Semantic Analysis).</w:t>
+      </w:r>
+    </w:p>
+    <w:p>
+      <w:pPr>
+        <w:numPr>
+          <w:ilvl w:val="0"/>
+          <w:numId w:val="1003"/>
+        </w:numPr>
+        <w:pStyle w:val="Compact"/>
+        <w:bidi/>
+      </w:pPr>
+      <w:r>
+        <w:rPr>
+          <w:rtl/>
+        </w:rPr>
+        <w:t xml:space="preserve">ترجمة كل هذا وتوليد كود HTML نقي وربطه بالبيانات لعرضه للمستخدم النهائي.</w:t>
       </w:r>
     </w:p>
     <w:p>
@@ -1191,24 +1207,16 @@
         </w:rPr>
         <w:t xml:space="preserve">:</w:t>
       </w:r>
-      <w:r>
-        <w:rPr>
-          <w:rtl/>
-        </w:rPr>
-        <w:t xml:space="preserve"> </w:t>
-      </w:r>
-      <w:r>
-        <w:rPr>
-          <w:rtl/>
-        </w:rPr>
-        <w:t xml:space="preserve">-</w:t>
-      </w:r>
-      <w:r>
-        <w:rPr>
-          <w:rtl/>
-        </w:rPr>
-        <w:t xml:space="preserve"> </w:t>
-      </w:r>
+    </w:p>
+    <w:p>
+      <w:pPr>
+        <w:numPr>
+          <w:ilvl w:val="0"/>
+          <w:numId w:val="1004"/>
+        </w:numPr>
+        <w:pStyle w:val="Compact"/>
+        <w:bidi/>
+      </w:pPr>
       <w:r>
         <w:rPr>
           <w:rtl/>
@@ -1254,24 +1262,16 @@
         </w:rPr>
         <w:t xml:space="preserve">الذي يمتد من زوار ANTLR الأساسيين لزيارة العقد وتحويلها إلى كائنات الـ AST التي برمجناها.</w:t>
       </w:r>
-      <w:r>
-        <w:rPr>
-          <w:rtl/>
-        </w:rPr>
-        <w:t xml:space="preserve"> </w:t>
-      </w:r>
-      <w:r>
-        <w:rPr>
-          <w:rtl/>
-        </w:rPr>
-        <w:t xml:space="preserve">-</w:t>
-      </w:r>
-      <w:r>
-        <w:rPr>
-          <w:rtl/>
-        </w:rPr>
-        <w:t xml:space="preserve"> </w:t>
-      </w:r>
+    </w:p>
+    <w:p>
+      <w:pPr>
+        <w:numPr>
+          <w:ilvl w:val="0"/>
+          <w:numId w:val="1004"/>
+        </w:numPr>
+        <w:pStyle w:val="Compact"/>
+        <w:bidi/>
+      </w:pPr>
       <w:r>
         <w:rPr>
           <w:rtl/>
@@ -1447,29 +1447,37 @@
         </w:rPr>
         <w:t xml:space="preserve">في لغة جافا، بحيث:</w:t>
       </w:r>
-      <w:r>
-        <w:rPr>
-          <w:rtl/>
-        </w:rPr>
-        <w:t xml:space="preserve"> </w:t>
-      </w:r>
-      <w:r>
-        <w:rPr>
-          <w:rtl/>
-        </w:rPr>
-        <w:t xml:space="preserve">- يمر الكود على كافة حقول الكلاس (Fields) في وقت التشغيل (Runtime).</w:t>
-      </w:r>
-      <w:r>
-        <w:rPr>
-          <w:rtl/>
-        </w:rPr>
-        <w:t xml:space="preserve"> </w:t>
-      </w:r>
-      <w:r>
-        <w:rPr>
-          <w:rtl/>
-        </w:rPr>
-        <w:t xml:space="preserve">- يستثني برمجياً الحقول التي تسبب تكراراً لانهائياً:</w:t>
+    </w:p>
+    <w:p>
+      <w:pPr>
+        <w:numPr>
+          <w:ilvl w:val="0"/>
+          <w:numId w:val="1005"/>
+        </w:numPr>
+        <w:pStyle w:val="Compact"/>
+        <w:bidi/>
+      </w:pPr>
+      <w:r>
+        <w:rPr>
+          <w:rtl/>
+        </w:rPr>
+        <w:t xml:space="preserve">يمر الكود على كافة حقول الكلاس (Fields) في وقت التشغيل (Runtime).</w:t>
+      </w:r>
+    </w:p>
+    <w:p>
+      <w:pPr>
+        <w:numPr>
+          <w:ilvl w:val="0"/>
+          <w:numId w:val="1005"/>
+        </w:numPr>
+        <w:pStyle w:val="Compact"/>
+        <w:bidi/>
+      </w:pPr>
+      <w:r>
+        <w:rPr>
+          <w:rtl/>
+        </w:rPr>
+        <w:t xml:space="preserve">يستثني برمجياً الحقول التي تسبب تكراراً لانهائياً:</w:t>
       </w:r>
       <w:r>
         <w:rPr>
@@ -1484,17 +1492,21 @@
         </w:rPr>
         <w:t xml:space="preserve">if(field.getName().equals("parent") || field.getName().equals("scope") || field.getName().equals("children")) continue;</w:t>
       </w:r>
-      <w:r>
-        <w:rPr>
-          <w:rtl/>
-        </w:rPr>
-        <w:t xml:space="preserve"> </w:t>
-      </w:r>
-      <w:r>
-        <w:rPr>
-          <w:rtl/>
-        </w:rPr>
-        <w:t xml:space="preserve">- يعالج الخرائط (Maps) والقوائم (Lists) بذكاء ليولد في النهاية ملفي</w:t>
+    </w:p>
+    <w:p>
+      <w:pPr>
+        <w:numPr>
+          <w:ilvl w:val="0"/>
+          <w:numId w:val="1005"/>
+        </w:numPr>
+        <w:pStyle w:val="Compact"/>
+        <w:bidi/>
+      </w:pPr>
+      <w:r>
+        <w:rPr>
+          <w:rtl/>
+        </w:rPr>
+        <w:t xml:space="preserve">يعالج الخرائط (Maps) والقوائم (Lists) بذكاء ليولد في النهاية ملفي</w:t>
       </w:r>
       <w:r>
         <w:rPr>
@@ -1895,24 +1907,16 @@
         </w:rPr>
         <w:t xml:space="preserve">الكود كافياً، بل وجب علينا تتبع وفهم المتغيرات، الدوال، الكتل (Blocks)، والمجالات (Scopes). لذلك صممنا نظام مجالات هرمي (Scope Hierarchy):</w:t>
       </w:r>
-      <w:r>
-        <w:rPr>
-          <w:rtl/>
-        </w:rPr>
-        <w:t xml:space="preserve"> </w:t>
-      </w:r>
-      <w:r>
-        <w:rPr>
-          <w:rtl/>
-        </w:rPr>
-        <w:t xml:space="preserve">1.</w:t>
-      </w:r>
-      <w:r>
-        <w:rPr>
-          <w:rtl/>
-        </w:rPr>
-        <w:t xml:space="preserve"> </w:t>
-      </w:r>
+    </w:p>
+    <w:p>
+      <w:pPr>
+        <w:numPr>
+          <w:ilvl w:val="0"/>
+          <w:numId w:val="1006"/>
+        </w:numPr>
+        <w:pStyle w:val="Compact"/>
+        <w:bidi/>
+      </w:pPr>
       <w:r>
         <w:rPr>
           <w:rtl/>
@@ -1933,24 +1937,16 @@
         </w:rPr>
         <w:t xml:space="preserve">يحتوي على المتغيرات والدوال المعرفة على مستوى الملف ككل.</w:t>
       </w:r>
-      <w:r>
-        <w:rPr>
-          <w:rtl/>
-        </w:rPr>
-        <w:t xml:space="preserve"> </w:t>
-      </w:r>
-      <w:r>
-        <w:rPr>
-          <w:rtl/>
-        </w:rPr>
-        <w:t xml:space="preserve">2.</w:t>
-      </w:r>
-      <w:r>
-        <w:rPr>
-          <w:rtl/>
-        </w:rPr>
-        <w:t xml:space="preserve"> </w:t>
-      </w:r>
+    </w:p>
+    <w:p>
+      <w:pPr>
+        <w:numPr>
+          <w:ilvl w:val="0"/>
+          <w:numId w:val="1006"/>
+        </w:numPr>
+        <w:pStyle w:val="Compact"/>
+        <w:bidi/>
+      </w:pPr>
       <w:r>
         <w:rPr>
           <w:rtl/>
@@ -2133,17 +2129,21 @@
         </w:rPr>
         <w:t xml:space="preserve">قمنا بـ:</w:t>
       </w:r>
-      <w:r>
-        <w:rPr>
-          <w:rtl/>
-        </w:rPr>
-        <w:t xml:space="preserve"> </w:t>
-      </w:r>
-      <w:r>
-        <w:rPr>
-          <w:rtl/>
-        </w:rPr>
-        <w:t xml:space="preserve">- تسجيل المتغيرات المُمررة من تابع</w:t>
+    </w:p>
+    <w:p>
+      <w:pPr>
+        <w:numPr>
+          <w:ilvl w:val="0"/>
+          <w:numId w:val="1007"/>
+        </w:numPr>
+        <w:pStyle w:val="Compact"/>
+        <w:bidi/>
+      </w:pPr>
+      <w:r>
+        <w:rPr>
+          <w:rtl/>
+        </w:rPr>
+        <w:t xml:space="preserve">تسجيل المتغيرات المُمررة من تابع</w:t>
       </w:r>
       <w:r>
         <w:rPr>
@@ -2164,17 +2164,21 @@
         </w:rPr>
         <w:t xml:space="preserve">.</w:t>
       </w:r>
-      <w:r>
-        <w:rPr>
-          <w:rtl/>
-        </w:rPr>
-        <w:t xml:space="preserve"> </w:t>
-      </w:r>
-      <w:r>
-        <w:rPr>
-          <w:rtl/>
-        </w:rPr>
-        <w:t xml:space="preserve">- تسجيل متغيرات حلقة التكرار</w:t>
+    </w:p>
+    <w:p>
+      <w:pPr>
+        <w:numPr>
+          <w:ilvl w:val="0"/>
+          <w:numId w:val="1007"/>
+        </w:numPr>
+        <w:pStyle w:val="Compact"/>
+        <w:bidi/>
+      </w:pPr>
+      <w:r>
+        <w:rPr>
+          <w:rtl/>
+        </w:rPr>
+        <w:t xml:space="preserve">تسجيل متغيرات حلقة التكرار</w:t>
       </w:r>
       <w:r>
         <w:rPr>
@@ -2201,17 +2205,21 @@
         </w:rPr>
         <w:t xml:space="preserve">بحيث لا يمكن الوصول إليها خارج الحلقة.</w:t>
       </w:r>
-      <w:r>
-        <w:rPr>
-          <w:rtl/>
-        </w:rPr>
-        <w:t xml:space="preserve"> </w:t>
-      </w:r>
-      <w:r>
-        <w:rPr>
-          <w:rtl/>
-        </w:rPr>
-        <w:t xml:space="preserve">- تسجيل الكتل البرمجية</w:t>
+    </w:p>
+    <w:p>
+      <w:pPr>
+        <w:numPr>
+          <w:ilvl w:val="0"/>
+          <w:numId w:val="1007"/>
+        </w:numPr>
+        <w:pStyle w:val="Compact"/>
+        <w:bidi/>
+      </w:pPr>
+      <w:r>
+        <w:rPr>
+          <w:rtl/>
+        </w:rPr>
+        <w:t xml:space="preserve">تسجيل الكتل البرمجية</w:t>
       </w:r>
       <w:r>
         <w:rPr>
@@ -2659,17 +2667,21 @@
         </w:rPr>
         <w:t xml:space="preserve">أهم الأخطاء الدلالية (Errors):</w:t>
       </w:r>
-      <w:r>
-        <w:rPr>
-          <w:rtl/>
-        </w:rPr>
-        <w:t xml:space="preserve"> </w:t>
-      </w:r>
-      <w:r>
-        <w:rPr>
-          <w:rtl/>
-        </w:rPr>
-        <w:t xml:space="preserve">1. استخدام تعليمة</w:t>
+    </w:p>
+    <w:p>
+      <w:pPr>
+        <w:numPr>
+          <w:ilvl w:val="0"/>
+          <w:numId w:val="1008"/>
+        </w:numPr>
+        <w:pStyle w:val="Compact"/>
+        <w:bidi/>
+      </w:pPr>
+      <w:r>
+        <w:rPr>
+          <w:rtl/>
+        </w:rPr>
+        <w:t xml:space="preserve">استخدام تعليمة</w:t>
       </w:r>
       <w:r>
         <w:rPr>
@@ -2696,17 +2708,21 @@
         </w:rPr>
         <w:t xml:space="preserve">خارج الدالة.</w:t>
       </w:r>
-      <w:r>
-        <w:rPr>
-          <w:rtl/>
-        </w:rPr>
-        <w:t xml:space="preserve"> </w:t>
-      </w:r>
-      <w:r>
-        <w:rPr>
-          <w:rtl/>
-        </w:rPr>
-        <w:t xml:space="preserve">2. استخدام تعليمة</w:t>
+    </w:p>
+    <w:p>
+      <w:pPr>
+        <w:numPr>
+          <w:ilvl w:val="0"/>
+          <w:numId w:val="1008"/>
+        </w:numPr>
+        <w:pStyle w:val="Compact"/>
+        <w:bidi/>
+      </w:pPr>
+      <w:r>
+        <w:rPr>
+          <w:rtl/>
+        </w:rPr>
+        <w:t xml:space="preserve">استخدام تعليمة</w:t>
       </w:r>
       <w:r>
         <w:rPr>
@@ -2771,41 +2787,53 @@
         </w:rPr>
         <w:t xml:space="preserve">).</w:t>
       </w:r>
-      <w:r>
-        <w:rPr>
-          <w:rtl/>
-        </w:rPr>
-        <w:t xml:space="preserve"> </w:t>
-      </w:r>
-      <w:r>
-        <w:rPr>
-          <w:rtl/>
-        </w:rPr>
-        <w:t xml:space="preserve">3. تعريف الدالة أكثر من مرة بنفس الاسم (Duplicate function name).</w:t>
-      </w:r>
-      <w:r>
-        <w:rPr>
-          <w:rtl/>
-        </w:rPr>
-        <w:t xml:space="preserve"> </w:t>
-      </w:r>
-      <w:r>
-        <w:rPr>
-          <w:rtl/>
-        </w:rPr>
-        <w:t xml:space="preserve">4. تكرار اسم المعامل (Parameter) في نفس الدالة.</w:t>
-      </w:r>
-      <w:r>
-        <w:rPr>
-          <w:rtl/>
-        </w:rPr>
-        <w:t xml:space="preserve"> </w:t>
-      </w:r>
-      <w:r>
-        <w:rPr>
-          <w:rtl/>
-        </w:rPr>
-        <w:t xml:space="preserve">5. الإعلان عن متغير كـ</w:t>
+    </w:p>
+    <w:p>
+      <w:pPr>
+        <w:numPr>
+          <w:ilvl w:val="0"/>
+          <w:numId w:val="1008"/>
+        </w:numPr>
+        <w:pStyle w:val="Compact"/>
+        <w:bidi/>
+      </w:pPr>
+      <w:r>
+        <w:rPr>
+          <w:rtl/>
+        </w:rPr>
+        <w:t xml:space="preserve">تعريف الدالة أكثر من مرة بنفس الاسم (Duplicate function name).</w:t>
+      </w:r>
+    </w:p>
+    <w:p>
+      <w:pPr>
+        <w:numPr>
+          <w:ilvl w:val="0"/>
+          <w:numId w:val="1008"/>
+        </w:numPr>
+        <w:pStyle w:val="Compact"/>
+        <w:bidi/>
+      </w:pPr>
+      <w:r>
+        <w:rPr>
+          <w:rtl/>
+        </w:rPr>
+        <w:t xml:space="preserve">تكرار اسم المعامل (Parameter) في نفس الدالة.</w:t>
+      </w:r>
+    </w:p>
+    <w:p>
+      <w:pPr>
+        <w:numPr>
+          <w:ilvl w:val="0"/>
+          <w:numId w:val="1008"/>
+        </w:numPr>
+        <w:pStyle w:val="Compact"/>
+        <w:bidi/>
+      </w:pPr>
+      <w:r>
+        <w:rPr>
+          <w:rtl/>
+        </w:rPr>
+        <w:t xml:space="preserve">الإعلان عن متغير كـ</w:t>
       </w:r>
       <w:r>
         <w:rPr>
@@ -2832,29 +2860,37 @@
         </w:rPr>
         <w:t xml:space="preserve">بعد إسناد قيمة له محلياً.</w:t>
       </w:r>
-      <w:r>
-        <w:rPr>
-          <w:rtl/>
-        </w:rPr>
-        <w:t xml:space="preserve"> </w:t>
-      </w:r>
-      <w:r>
-        <w:rPr>
-          <w:rtl/>
-        </w:rPr>
-        <w:t xml:space="preserve">6. القسمة على صفر بشكل صريح.</w:t>
-      </w:r>
-      <w:r>
-        <w:rPr>
-          <w:rtl/>
-        </w:rPr>
-        <w:t xml:space="preserve"> </w:t>
-      </w:r>
-      <w:r>
-        <w:rPr>
-          <w:rtl/>
-        </w:rPr>
-        <w:t xml:space="preserve">7. كتابة كود غير قابل للوصول بعد تعليمة</w:t>
+    </w:p>
+    <w:p>
+      <w:pPr>
+        <w:numPr>
+          <w:ilvl w:val="0"/>
+          <w:numId w:val="1008"/>
+        </w:numPr>
+        <w:pStyle w:val="Compact"/>
+        <w:bidi/>
+      </w:pPr>
+      <w:r>
+        <w:rPr>
+          <w:rtl/>
+        </w:rPr>
+        <w:t xml:space="preserve">القسمة على صفر بشكل صريح.</w:t>
+      </w:r>
+    </w:p>
+    <w:p>
+      <w:pPr>
+        <w:numPr>
+          <w:ilvl w:val="0"/>
+          <w:numId w:val="1008"/>
+        </w:numPr>
+        <w:pStyle w:val="Compact"/>
+        <w:bidi/>
+      </w:pPr>
+      <w:r>
+        <w:rPr>
+          <w:rtl/>
+        </w:rPr>
+        <w:t xml:space="preserve">كتابة كود غير قابل للوصول بعد تعليمة</w:t>
       </w:r>
       <w:r>
         <w:rPr>
@@ -2875,17 +2911,21 @@
         </w:rPr>
         <w:t xml:space="preserve">.</w:t>
       </w:r>
-      <w:r>
-        <w:rPr>
-          <w:rtl/>
-        </w:rPr>
-        <w:t xml:space="preserve"> </w:t>
-      </w:r>
-      <w:r>
-        <w:rPr>
-          <w:rtl/>
-        </w:rPr>
-        <w:t xml:space="preserve">8. أخطاء الأنماط وعدم التوافق (Type Mismatch)، مثل جمع</w:t>
+    </w:p>
+    <w:p>
+      <w:pPr>
+        <w:numPr>
+          <w:ilvl w:val="0"/>
+          <w:numId w:val="1008"/>
+        </w:numPr>
+        <w:pStyle w:val="Compact"/>
+        <w:bidi/>
+      </w:pPr>
+      <w:r>
+        <w:rPr>
+          <w:rtl/>
+        </w:rPr>
+        <w:t xml:space="preserve">أخطاء الأنماط وعدم التوافق (Type Mismatch)، مثل جمع</w:t>
       </w:r>
       <w:r>
         <w:rPr>
@@ -2931,29 +2971,37 @@
         </w:rPr>
         <w:t xml:space="preserve">.</w:t>
       </w:r>
-      <w:r>
-        <w:rPr>
-          <w:rtl/>
-        </w:rPr>
-        <w:t xml:space="preserve"> </w:t>
-      </w:r>
-      <w:r>
-        <w:rPr>
-          <w:rtl/>
-        </w:rPr>
-        <w:t xml:space="preserve">9. دوران حلقة على كائن غير قابل للتكرار (Not iterable).</w:t>
-      </w:r>
-      <w:r>
-        <w:rPr>
-          <w:rtl/>
-        </w:rPr>
-        <w:t xml:space="preserve"> </w:t>
-      </w:r>
-      <w:r>
-        <w:rPr>
-          <w:rtl/>
-        </w:rPr>
-        <w:t xml:space="preserve">10. استخدام متغير خارج النطاق الخاص به (Out of scope) أو غير معرّف أساساً.</w:t>
+    </w:p>
+    <w:p>
+      <w:pPr>
+        <w:numPr>
+          <w:ilvl w:val="0"/>
+          <w:numId w:val="1008"/>
+        </w:numPr>
+        <w:pStyle w:val="Compact"/>
+        <w:bidi/>
+      </w:pPr>
+      <w:r>
+        <w:rPr>
+          <w:rtl/>
+        </w:rPr>
+        <w:t xml:space="preserve">دوران حلقة على كائن غير قابل للتكرار (Not iterable).</w:t>
+      </w:r>
+    </w:p>
+    <w:p>
+      <w:pPr>
+        <w:numPr>
+          <w:ilvl w:val="0"/>
+          <w:numId w:val="1008"/>
+        </w:numPr>
+        <w:pStyle w:val="Compact"/>
+        <w:bidi/>
+      </w:pPr>
+      <w:r>
+        <w:rPr>
+          <w:rtl/>
+        </w:rPr>
+        <w:t xml:space="preserve">استخدام متغير خارج النطاق الخاص به (Out of scope) أو غير معرّف أساساً.</w:t>
       </w:r>
     </w:p>
     <w:p>
@@ -2968,65 +3016,85 @@
         </w:rPr>
         <w:t xml:space="preserve">أهم التحذيرات (Warnings):</w:t>
       </w:r>
-      <w:r>
-        <w:rPr>
-          <w:rtl/>
-        </w:rPr>
-        <w:t xml:space="preserve"> </w:t>
-      </w:r>
-      <w:r>
-        <w:rPr>
-          <w:rtl/>
-        </w:rPr>
-        <w:t xml:space="preserve">1. استيراد نفس المكتبة (Import) أكثر من مرة.</w:t>
-      </w:r>
-      <w:r>
-        <w:rPr>
-          <w:rtl/>
-        </w:rPr>
-        <w:t xml:space="preserve"> </w:t>
-      </w:r>
-      <w:r>
-        <w:rPr>
-          <w:rtl/>
-        </w:rPr>
-        <w:t xml:space="preserve">2. استخدام اسم دالة كمتغير مما يؤدي إلى طمس الدالة الأصلية.</w:t>
-      </w:r>
-      <w:r>
-        <w:rPr>
-          <w:rtl/>
-        </w:rPr>
-        <w:t xml:space="preserve"> </w:t>
-      </w:r>
-      <w:r>
-        <w:rPr>
-          <w:rtl/>
-        </w:rPr>
-        <w:t xml:space="preserve">3. تعريف متغير محلي دون استخدامه أبداً (Unused variable).</w:t>
-      </w:r>
-      <w:r>
-        <w:rPr>
-          <w:rtl/>
-        </w:rPr>
-        <w:t xml:space="preserve"> </w:t>
-      </w:r>
-      <w:r>
-        <w:rPr>
-          <w:rtl/>
-        </w:rPr>
-        <w:t xml:space="preserve">4. استدعاء دالة لا يمكن الوصول إليها.</w:t>
-      </w:r>
-      <w:r>
-        <w:rPr>
-          <w:rtl/>
-        </w:rPr>
-        <w:t xml:space="preserve"> </w:t>
-      </w:r>
-      <w:r>
-        <w:rPr>
-          <w:rtl/>
-        </w:rPr>
-        <w:t xml:space="preserve">5. تعريف دالة فارغة تحتوي فقط على</w:t>
+    </w:p>
+    <w:p>
+      <w:pPr>
+        <w:numPr>
+          <w:ilvl w:val="0"/>
+          <w:numId w:val="1009"/>
+        </w:numPr>
+        <w:pStyle w:val="Compact"/>
+        <w:bidi/>
+      </w:pPr>
+      <w:r>
+        <w:rPr>
+          <w:rtl/>
+        </w:rPr>
+        <w:t xml:space="preserve">استيراد نفس المكتبة (Import) أكثر من مرة.</w:t>
+      </w:r>
+    </w:p>
+    <w:p>
+      <w:pPr>
+        <w:numPr>
+          <w:ilvl w:val="0"/>
+          <w:numId w:val="1009"/>
+        </w:numPr>
+        <w:pStyle w:val="Compact"/>
+        <w:bidi/>
+      </w:pPr>
+      <w:r>
+        <w:rPr>
+          <w:rtl/>
+        </w:rPr>
+        <w:t xml:space="preserve">استخدام اسم دالة كمتغير مما يؤدي إلى طمس الدالة الأصلية.</w:t>
+      </w:r>
+    </w:p>
+    <w:p>
+      <w:pPr>
+        <w:numPr>
+          <w:ilvl w:val="0"/>
+          <w:numId w:val="1009"/>
+        </w:numPr>
+        <w:pStyle w:val="Compact"/>
+        <w:bidi/>
+      </w:pPr>
+      <w:r>
+        <w:rPr>
+          <w:rtl/>
+        </w:rPr>
+        <w:t xml:space="preserve">تعريف متغير محلي دون استخدامه أبداً (Unused variable).</w:t>
+      </w:r>
+    </w:p>
+    <w:p>
+      <w:pPr>
+        <w:numPr>
+          <w:ilvl w:val="0"/>
+          <w:numId w:val="1009"/>
+        </w:numPr>
+        <w:pStyle w:val="Compact"/>
+        <w:bidi/>
+      </w:pPr>
+      <w:r>
+        <w:rPr>
+          <w:rtl/>
+        </w:rPr>
+        <w:t xml:space="preserve">استدعاء دالة لا يمكن الوصول إليها.</w:t>
+      </w:r>
+    </w:p>
+    <w:p>
+      <w:pPr>
+        <w:numPr>
+          <w:ilvl w:val="0"/>
+          <w:numId w:val="1009"/>
+        </w:numPr>
+        <w:pStyle w:val="Compact"/>
+        <w:bidi/>
+      </w:pPr>
+      <w:r>
+        <w:rPr>
+          <w:rtl/>
+        </w:rPr>
+        <w:t xml:space="preserve">تعريف دالة فارغة تحتوي فقط على</w:t>
       </w:r>
       <w:r>
         <w:rPr>
@@ -3047,41 +3115,53 @@
         </w:rPr>
         <w:t xml:space="preserve">.</w:t>
       </w:r>
-      <w:r>
-        <w:rPr>
-          <w:rtl/>
-        </w:rPr>
-        <w:t xml:space="preserve"> </w:t>
-      </w:r>
-      <w:r>
-        <w:rPr>
-          <w:rtl/>
-        </w:rPr>
-        <w:t xml:space="preserve">6. استخدام اسم قبل الإسناد إليه في النطاق المحلي.</w:t>
-      </w:r>
-      <w:r>
-        <w:rPr>
-          <w:rtl/>
-        </w:rPr>
-        <w:t xml:space="preserve"> </w:t>
-      </w:r>
-      <w:r>
-        <w:rPr>
-          <w:rtl/>
-        </w:rPr>
-        <w:t xml:space="preserve">7. استدعاء دالة بعدد ضخم من المعاملات (&gt; 7).</w:t>
-      </w:r>
-      <w:r>
-        <w:rPr>
-          <w:rtl/>
-        </w:rPr>
-        <w:t xml:space="preserve"> </w:t>
-      </w:r>
-      <w:r>
-        <w:rPr>
-          <w:rtl/>
-        </w:rPr>
-        <w:t xml:space="preserve">8. المقارنة مع</w:t>
+    </w:p>
+    <w:p>
+      <w:pPr>
+        <w:numPr>
+          <w:ilvl w:val="0"/>
+          <w:numId w:val="1009"/>
+        </w:numPr>
+        <w:pStyle w:val="Compact"/>
+        <w:bidi/>
+      </w:pPr>
+      <w:r>
+        <w:rPr>
+          <w:rtl/>
+        </w:rPr>
+        <w:t xml:space="preserve">استخدام اسم قبل الإسناد إليه في النطاق المحلي.</w:t>
+      </w:r>
+    </w:p>
+    <w:p>
+      <w:pPr>
+        <w:numPr>
+          <w:ilvl w:val="0"/>
+          <w:numId w:val="1009"/>
+        </w:numPr>
+        <w:pStyle w:val="Compact"/>
+        <w:bidi/>
+      </w:pPr>
+      <w:r>
+        <w:rPr>
+          <w:rtl/>
+        </w:rPr>
+        <w:t xml:space="preserve">استدعاء دالة بعدد ضخم من المعاملات (&gt; 7).</w:t>
+      </w:r>
+    </w:p>
+    <w:p>
+      <w:pPr>
+        <w:numPr>
+          <w:ilvl w:val="0"/>
+          <w:numId w:val="1009"/>
+        </w:numPr>
+        <w:pStyle w:val="Compact"/>
+        <w:bidi/>
+      </w:pPr>
+      <w:r>
+        <w:rPr>
+          <w:rtl/>
+        </w:rPr>
+        <w:t xml:space="preserve">المقارنة مع</w:t>
       </w:r>
       <w:r>
         <w:rPr>
@@ -3657,17 +3737,21 @@
         </w:rPr>
         <w:t xml:space="preserve">أهم الأخطاء (Errors):</w:t>
       </w:r>
-      <w:r>
-        <w:rPr>
-          <w:rtl/>
-        </w:rPr>
-        <w:t xml:space="preserve"> </w:t>
-      </w:r>
-      <w:r>
-        <w:rPr>
-          <w:rtl/>
-        </w:rPr>
-        <w:t xml:space="preserve">1. تعريف</w:t>
+    </w:p>
+    <w:p>
+      <w:pPr>
+        <w:numPr>
+          <w:ilvl w:val="0"/>
+          <w:numId w:val="1010"/>
+        </w:numPr>
+        <w:pStyle w:val="Compact"/>
+        <w:bidi/>
+      </w:pPr>
+      <w:r>
+        <w:rPr>
+          <w:rtl/>
+        </w:rPr>
+        <w:t xml:space="preserve">تعريف</w:t>
       </w:r>
       <w:r>
         <w:rPr>
@@ -3694,17 +3778,21 @@
         </w:rPr>
         <w:t xml:space="preserve">بنفس الاسم أكثر من مرة في نفس الملف.</w:t>
       </w:r>
-      <w:r>
-        <w:rPr>
-          <w:rtl/>
-        </w:rPr>
-        <w:t xml:space="preserve"> </w:t>
-      </w:r>
-      <w:r>
-        <w:rPr>
-          <w:rtl/>
-        </w:rPr>
-        <w:t xml:space="preserve">2. استخدام</w:t>
+    </w:p>
+    <w:p>
+      <w:pPr>
+        <w:numPr>
+          <w:ilvl w:val="0"/>
+          <w:numId w:val="1010"/>
+        </w:numPr>
+        <w:pStyle w:val="Compact"/>
+        <w:bidi/>
+      </w:pPr>
+      <w:r>
+        <w:rPr>
+          <w:rtl/>
+        </w:rPr>
+        <w:t xml:space="preserve">استخدام</w:t>
       </w:r>
       <w:r>
         <w:rPr>
@@ -3731,17 +3819,21 @@
         </w:rPr>
         <w:t xml:space="preserve">أكثر من مرة أو بشكل دائري (وراثة القالب لنفسه).</w:t>
       </w:r>
-      <w:r>
-        <w:rPr>
-          <w:rtl/>
-        </w:rPr>
-        <w:t xml:space="preserve"> </w:t>
-      </w:r>
-      <w:r>
-        <w:rPr>
-          <w:rtl/>
-        </w:rPr>
-        <w:t xml:space="preserve">3. استدعاء ملف غير موجود في</w:t>
+    </w:p>
+    <w:p>
+      <w:pPr>
+        <w:numPr>
+          <w:ilvl w:val="0"/>
+          <w:numId w:val="1010"/>
+        </w:numPr>
+        <w:pStyle w:val="Compact"/>
+        <w:bidi/>
+      </w:pPr>
+      <w:r>
+        <w:rPr>
+          <w:rtl/>
+        </w:rPr>
+        <w:t xml:space="preserve">استدعاء ملف غير موجود في</w:t>
       </w:r>
       <w:r>
         <w:rPr>
@@ -3812,17 +3904,21 @@
         </w:rPr>
         <w:t xml:space="preserve">.</w:t>
       </w:r>
-      <w:r>
-        <w:rPr>
-          <w:rtl/>
-        </w:rPr>
-        <w:t xml:space="preserve"> </w:t>
-      </w:r>
-      <w:r>
-        <w:rPr>
-          <w:rtl/>
-        </w:rPr>
-        <w:t xml:space="preserve">4. عدم تطابق التاغات (Tags) في HTML (مثلاً</w:t>
+    </w:p>
+    <w:p>
+      <w:pPr>
+        <w:numPr>
+          <w:ilvl w:val="0"/>
+          <w:numId w:val="1010"/>
+        </w:numPr>
+        <w:pStyle w:val="Compact"/>
+        <w:bidi/>
+      </w:pPr>
+      <w:r>
+        <w:rPr>
+          <w:rtl/>
+        </w:rPr>
+        <w:t xml:space="preserve">عدم تطابق التاغات (Tags) في HTML (مثلاً</w:t>
       </w:r>
       <w:r>
         <w:rPr>
@@ -3868,17 +3964,21 @@
         </w:rPr>
         <w:t xml:space="preserve">).</w:t>
       </w:r>
-      <w:r>
-        <w:rPr>
-          <w:rtl/>
-        </w:rPr>
-        <w:t xml:space="preserve"> </w:t>
-      </w:r>
-      <w:r>
-        <w:rPr>
-          <w:rtl/>
-        </w:rPr>
-        <w:t xml:space="preserve">5. استخدام متغير لم يتم تمريره من الدالة</w:t>
+    </w:p>
+    <w:p>
+      <w:pPr>
+        <w:numPr>
+          <w:ilvl w:val="0"/>
+          <w:numId w:val="1010"/>
+        </w:numPr>
+        <w:pStyle w:val="Compact"/>
+        <w:bidi/>
+      </w:pPr>
+      <w:r>
+        <w:rPr>
+          <w:rtl/>
+        </w:rPr>
+        <w:t xml:space="preserve">استخدام متغير لم يتم تمريره من الدالة</w:t>
       </w:r>
       <w:r>
         <w:rPr>
@@ -3905,17 +4005,21 @@
         </w:rPr>
         <w:t xml:space="preserve">في بايثون.</w:t>
       </w:r>
-      <w:r>
-        <w:rPr>
-          <w:rtl/>
-        </w:rPr>
-        <w:t xml:space="preserve"> </w:t>
-      </w:r>
-      <w:r>
-        <w:rPr>
-          <w:rtl/>
-        </w:rPr>
-        <w:t xml:space="preserve">6. الوصول إلى خاصية (Attribute) غير موجودة في الـ Mock Data (مثل محاولة طباعة</w:t>
+    </w:p>
+    <w:p>
+      <w:pPr>
+        <w:numPr>
+          <w:ilvl w:val="0"/>
+          <w:numId w:val="1010"/>
+        </w:numPr>
+        <w:pStyle w:val="Compact"/>
+        <w:bidi/>
+      </w:pPr>
+      <w:r>
+        <w:rPr>
+          <w:rtl/>
+        </w:rPr>
+        <w:t xml:space="preserve">الوصول إلى خاصية (Attribute) غير موجودة في الـ Mock Data (مثل محاولة طباعة</w:t>
       </w:r>
       <w:r>
         <w:rPr>
@@ -3967,29 +4071,37 @@
         </w:rPr>
         <w:t xml:space="preserve">غير متوفرة).</w:t>
       </w:r>
-      <w:r>
-        <w:rPr>
-          <w:rtl/>
-        </w:rPr>
-        <w:t xml:space="preserve"> </w:t>
-      </w:r>
-      <w:r>
-        <w:rPr>
-          <w:rtl/>
-        </w:rPr>
-        <w:t xml:space="preserve">7. الوصول إلى فهرس (Index) خارج حدود القائمة الممررة (Index out of bounds).</w:t>
-      </w:r>
-      <w:r>
-        <w:rPr>
-          <w:rtl/>
-        </w:rPr>
-        <w:t xml:space="preserve"> </w:t>
-      </w:r>
-      <w:r>
-        <w:rPr>
-          <w:rtl/>
-        </w:rPr>
-        <w:t xml:space="preserve">8. استخدام الدالة</w:t>
+    </w:p>
+    <w:p>
+      <w:pPr>
+        <w:numPr>
+          <w:ilvl w:val="0"/>
+          <w:numId w:val="1010"/>
+        </w:numPr>
+        <w:pStyle w:val="Compact"/>
+        <w:bidi/>
+      </w:pPr>
+      <w:r>
+        <w:rPr>
+          <w:rtl/>
+        </w:rPr>
+        <w:t xml:space="preserve">الوصول إلى فهرس (Index) خارج حدود القائمة الممررة (Index out of bounds).</w:t>
+      </w:r>
+    </w:p>
+    <w:p>
+      <w:pPr>
+        <w:numPr>
+          <w:ilvl w:val="0"/>
+          <w:numId w:val="1010"/>
+        </w:numPr>
+        <w:pStyle w:val="Compact"/>
+        <w:bidi/>
+      </w:pPr>
+      <w:r>
+        <w:rPr>
+          <w:rtl/>
+        </w:rPr>
+        <w:t xml:space="preserve">استخدام الدالة</w:t>
       </w:r>
       <w:r>
         <w:rPr>
@@ -4048,29 +4160,37 @@
         </w:rPr>
         <w:t xml:space="preserve">أهم التحذيرات (Warnings):</w:t>
       </w:r>
-      <w:r>
-        <w:rPr>
-          <w:rtl/>
-        </w:rPr>
-        <w:t xml:space="preserve"> </w:t>
-      </w:r>
-      <w:r>
-        <w:rPr>
-          <w:rtl/>
-        </w:rPr>
-        <w:t xml:space="preserve">1. استخدام مرشح (Filter) غير معروف في جينجا.</w:t>
-      </w:r>
-      <w:r>
-        <w:rPr>
-          <w:rtl/>
-        </w:rPr>
-        <w:t xml:space="preserve"> </w:t>
-      </w:r>
-      <w:r>
-        <w:rPr>
-          <w:rtl/>
-        </w:rPr>
-        <w:t xml:space="preserve">2. استخدام متغير الحلقة</w:t>
+    </w:p>
+    <w:p>
+      <w:pPr>
+        <w:numPr>
+          <w:ilvl w:val="0"/>
+          <w:numId w:val="1011"/>
+        </w:numPr>
+        <w:pStyle w:val="Compact"/>
+        <w:bidi/>
+      </w:pPr>
+      <w:r>
+        <w:rPr>
+          <w:rtl/>
+        </w:rPr>
+        <w:t xml:space="preserve">استخدام مرشح (Filter) غير معروف في جينجا.</w:t>
+      </w:r>
+    </w:p>
+    <w:p>
+      <w:pPr>
+        <w:numPr>
+          <w:ilvl w:val="0"/>
+          <w:numId w:val="1011"/>
+        </w:numPr>
+        <w:pStyle w:val="Compact"/>
+        <w:bidi/>
+      </w:pPr>
+      <w:r>
+        <w:rPr>
+          <w:rtl/>
+        </w:rPr>
+        <w:t xml:space="preserve">استخدام متغير الحلقة</w:t>
       </w:r>
       <w:r>
         <w:rPr>
@@ -4122,17 +4242,21 @@
         </w:rPr>
         <w:t xml:space="preserve">الخاصة به.</w:t>
       </w:r>
-      <w:r>
-        <w:rPr>
-          <w:rtl/>
-        </w:rPr>
-        <w:t xml:space="preserve"> </w:t>
-      </w:r>
-      <w:r>
-        <w:rPr>
-          <w:rtl/>
-        </w:rPr>
-        <w:t xml:space="preserve">3. إعادة تعريف متغير ممرر من بايثون باستخدام</w:t>
+    </w:p>
+    <w:p>
+      <w:pPr>
+        <w:numPr>
+          <w:ilvl w:val="0"/>
+          <w:numId w:val="1011"/>
+        </w:numPr>
+        <w:pStyle w:val="Compact"/>
+        <w:bidi/>
+      </w:pPr>
+      <w:r>
+        <w:rPr>
+          <w:rtl/>
+        </w:rPr>
+        <w:t xml:space="preserve">إعادة تعريف متغير ممرر من بايثون باستخدام</w:t>
       </w:r>
       <w:r>
         <w:rPr>
@@ -4153,17 +4277,21 @@
         </w:rPr>
         <w:t xml:space="preserve">.</w:t>
       </w:r>
-      <w:r>
-        <w:rPr>
-          <w:rtl/>
-        </w:rPr>
-        <w:t xml:space="preserve"> </w:t>
-      </w:r>
-      <w:r>
-        <w:rPr>
-          <w:rtl/>
-        </w:rPr>
-        <w:t xml:space="preserve">4. كتابة كود جينجا قبل تعليمة</w:t>
+    </w:p>
+    <w:p>
+      <w:pPr>
+        <w:numPr>
+          <w:ilvl w:val="0"/>
+          <w:numId w:val="1011"/>
+        </w:numPr>
+        <w:pStyle w:val="Compact"/>
+        <w:bidi/>
+      </w:pPr>
+      <w:r>
+        <w:rPr>
+          <w:rtl/>
+        </w:rPr>
+        <w:t xml:space="preserve">كتابة كود جينجا قبل تعليمة</w:t>
       </w:r>
       <w:r>
         <w:rPr>
@@ -4184,17 +4312,21 @@
         </w:rPr>
         <w:t xml:space="preserve">.</w:t>
       </w:r>
-      <w:r>
-        <w:rPr>
-          <w:rtl/>
-        </w:rPr>
-        <w:t xml:space="preserve"> </w:t>
-      </w:r>
-      <w:r>
-        <w:rPr>
-          <w:rtl/>
-        </w:rPr>
-        <w:t xml:space="preserve">5. عمل حلقة</w:t>
+    </w:p>
+    <w:p>
+      <w:pPr>
+        <w:numPr>
+          <w:ilvl w:val="0"/>
+          <w:numId w:val="1011"/>
+        </w:numPr>
+        <w:pStyle w:val="Compact"/>
+        <w:bidi/>
+      </w:pPr>
+      <w:r>
+        <w:rPr>
+          <w:rtl/>
+        </w:rPr>
+        <w:t xml:space="preserve">عمل حلقة</w:t>
       </w:r>
       <w:r>
         <w:rPr>
@@ -5097,29 +5229,37 @@
         </w:rPr>
         <w:t xml:space="preserve">ليكون مسؤولاً عن هذه المهمة المعقدة. تتمثل مهامه الأساسية في:</w:t>
       </w:r>
-      <w:r>
-        <w:rPr>
-          <w:rtl/>
-        </w:rPr>
-        <w:t xml:space="preserve"> </w:t>
-      </w:r>
-      <w:r>
-        <w:rPr>
-          <w:rtl/>
-        </w:rPr>
-        <w:t xml:space="preserve">- قراءة شجرة الـ AST الخاصة بـ Jinja2.</w:t>
-      </w:r>
-      <w:r>
-        <w:rPr>
-          <w:rtl/>
-        </w:rPr>
-        <w:t xml:space="preserve"> </w:t>
-      </w:r>
-      <w:r>
-        <w:rPr>
-          <w:rtl/>
-        </w:rPr>
-        <w:t xml:space="preserve">- ربط قيم المتغيرات القادمة من بايثون في الأماكن المخصصة لها في القالب (مثل</w:t>
+    </w:p>
+    <w:p>
+      <w:pPr>
+        <w:numPr>
+          <w:ilvl w:val="0"/>
+          <w:numId w:val="1012"/>
+        </w:numPr>
+        <w:pStyle w:val="Compact"/>
+        <w:bidi/>
+      </w:pPr>
+      <w:r>
+        <w:rPr>
+          <w:rtl/>
+        </w:rPr>
+        <w:t xml:space="preserve">قراءة شجرة الـ AST الخاصة بـ Jinja2.</w:t>
+      </w:r>
+    </w:p>
+    <w:p>
+      <w:pPr>
+        <w:numPr>
+          <w:ilvl w:val="0"/>
+          <w:numId w:val="1012"/>
+        </w:numPr>
+        <w:pStyle w:val="Compact"/>
+        <w:bidi/>
+      </w:pPr>
+      <w:r>
+        <w:rPr>
+          <w:rtl/>
+        </w:rPr>
+        <w:t xml:space="preserve">ربط قيم المتغيرات القادمة من بايثون في الأماكن المخصصة لها في القالب (مثل</w:t>
       </w:r>
       <w:r>
         <w:rPr>
@@ -5140,17 +5280,21 @@
         </w:rPr>
         <w:t xml:space="preserve">).</w:t>
       </w:r>
-      <w:r>
-        <w:rPr>
-          <w:rtl/>
-        </w:rPr>
-        <w:t xml:space="preserve"> </w:t>
-      </w:r>
-      <w:r>
-        <w:rPr>
-          <w:rtl/>
-        </w:rPr>
-        <w:t xml:space="preserve">- تنفيذ الحلقات</w:t>
+    </w:p>
+    <w:p>
+      <w:pPr>
+        <w:numPr>
+          <w:ilvl w:val="0"/>
+          <w:numId w:val="1012"/>
+        </w:numPr>
+        <w:pStyle w:val="Compact"/>
+        <w:bidi/>
+      </w:pPr>
+      <w:r>
+        <w:rPr>
+          <w:rtl/>
+        </w:rPr>
+        <w:t xml:space="preserve">تنفيذ الحلقات</w:t>
       </w:r>
       <w:r>
         <w:rPr>
@@ -5177,17 +5321,21 @@
         </w:rPr>
         <w:t xml:space="preserve">وتوليد عناصر HTML متكررة بناءً على طول القائمة.</w:t>
       </w:r>
-      <w:r>
-        <w:rPr>
-          <w:rtl/>
-        </w:rPr>
-        <w:t xml:space="preserve"> </w:t>
-      </w:r>
-      <w:r>
-        <w:rPr>
-          <w:rtl/>
-        </w:rPr>
-        <w:t xml:space="preserve">- تنفيذ الشروط</w:t>
+    </w:p>
+    <w:p>
+      <w:pPr>
+        <w:numPr>
+          <w:ilvl w:val="0"/>
+          <w:numId w:val="1012"/>
+        </w:numPr>
+        <w:pStyle w:val="Compact"/>
+        <w:bidi/>
+      </w:pPr>
+      <w:r>
+        <w:rPr>
+          <w:rtl/>
+        </w:rPr>
+        <w:t xml:space="preserve">تنفيذ الشروط</w:t>
       </w:r>
       <w:r>
         <w:rPr>
@@ -5214,17 +5362,21 @@
         </w:rPr>
         <w:t xml:space="preserve">وإخفاء أو إظهار كتل الـ HTML بناءً على النتيجة المنطقية.</w:t>
       </w:r>
-      <w:r>
-        <w:rPr>
-          <w:rtl/>
-        </w:rPr>
-        <w:t xml:space="preserve"> </w:t>
-      </w:r>
-      <w:r>
-        <w:rPr>
-          <w:rtl/>
-        </w:rPr>
-        <w:t xml:space="preserve">- حل الوراثة</w:t>
+    </w:p>
+    <w:p>
+      <w:pPr>
+        <w:numPr>
+          <w:ilvl w:val="0"/>
+          <w:numId w:val="1012"/>
+        </w:numPr>
+        <w:pStyle w:val="Compact"/>
+        <w:bidi/>
+      </w:pPr>
+      <w:r>
+        <w:rPr>
+          <w:rtl/>
+        </w:rPr>
+        <w:t xml:space="preserve">حل الوراثة</w:t>
       </w:r>
       <w:r>
         <w:rPr>
@@ -5295,17 +5447,21 @@
         </w:rPr>
         <w:t xml:space="preserve">.</w:t>
       </w:r>
-      <w:r>
-        <w:rPr>
-          <w:rtl/>
-        </w:rPr>
-        <w:t xml:space="preserve"> </w:t>
-      </w:r>
-      <w:r>
-        <w:rPr>
-          <w:rtl/>
-        </w:rPr>
-        <w:t xml:space="preserve">- تحويل مسارات</w:t>
+    </w:p>
+    <w:p>
+      <w:pPr>
+        <w:numPr>
+          <w:ilvl w:val="0"/>
+          <w:numId w:val="1012"/>
+        </w:numPr>
+        <w:pStyle w:val="Compact"/>
+        <w:bidi/>
+      </w:pPr>
+      <w:r>
+        <w:rPr>
+          <w:rtl/>
+        </w:rPr>
+        <w:t xml:space="preserve">تحويل مسارات</w:t>
       </w:r>
       <w:r>
         <w:rPr>
@@ -6699,24 +6855,15 @@
         </w:rPr>
         <w:t xml:space="preserve">يقوم هذا الخادم بالوظائف التالية:</w:t>
       </w:r>
-      <w:r>
-        <w:rPr>
-          <w:rtl/>
-        </w:rPr>
-        <w:t xml:space="preserve"> </w:t>
-      </w:r>
-      <w:r>
-        <w:rPr>
-          <w:rtl/>
-        </w:rPr>
-        <w:t xml:space="preserve">1.</w:t>
-      </w:r>
-      <w:r>
-        <w:rPr>
-          <w:rtl/>
-        </w:rPr>
-        <w:t xml:space="preserve"> </w:t>
-      </w:r>
+    </w:p>
+    <w:p>
+      <w:pPr>
+        <w:numPr>
+          <w:ilvl w:val="0"/>
+          <w:numId w:val="1013"/>
+        </w:numPr>
+        <w:bidi/>
+      </w:pPr>
       <w:r>
         <w:rPr>
           <w:rtl/>
@@ -6762,24 +6909,15 @@
         </w:rPr>
         <w:t xml:space="preserve">للمتصفح.</w:t>
       </w:r>
-      <w:r>
-        <w:rPr>
-          <w:rtl/>
-        </w:rPr>
-        <w:t xml:space="preserve"> </w:t>
-      </w:r>
-      <w:r>
-        <w:rPr>
-          <w:rtl/>
-        </w:rPr>
-        <w:t xml:space="preserve">2.</w:t>
-      </w:r>
-      <w:r>
-        <w:rPr>
-          <w:rtl/>
-        </w:rPr>
-        <w:t xml:space="preserve"> </w:t>
-      </w:r>
+    </w:p>
+    <w:p>
+      <w:pPr>
+        <w:numPr>
+          <w:ilvl w:val="0"/>
+          <w:numId w:val="1013"/>
+        </w:numPr>
+        <w:bidi/>
+      </w:pPr>
       <w:r>
         <w:rPr>
           <w:rtl/>
@@ -6844,24 +6982,15 @@
         </w:rPr>
         <w:t xml:space="preserve">.</w:t>
       </w:r>
-      <w:r>
-        <w:rPr>
-          <w:rtl/>
-        </w:rPr>
-        <w:t xml:space="preserve"> </w:t>
-      </w:r>
-      <w:r>
-        <w:rPr>
-          <w:rtl/>
-        </w:rPr>
-        <w:t xml:space="preserve">3.</w:t>
-      </w:r>
-      <w:r>
-        <w:rPr>
-          <w:rtl/>
-        </w:rPr>
-        <w:t xml:space="preserve"> </w:t>
-      </w:r>
+    </w:p>
+    <w:p>
+      <w:pPr>
+        <w:numPr>
+          <w:ilvl w:val="0"/>
+          <w:numId w:val="1013"/>
+        </w:numPr>
+        <w:bidi/>
+      </w:pPr>
       <w:r>
         <w:rPr>
           <w:rtl/>
@@ -6882,17 +7011,21 @@
         </w:rPr>
         <w:t xml:space="preserve">عندما يتلقى الخادم طلب POST لإضافة منتج أو حذفه، يقوم بـ:</w:t>
       </w:r>
-      <w:r>
-        <w:rPr>
-          <w:rtl/>
-        </w:rPr>
-        <w:t xml:space="preserve"> </w:t>
-      </w:r>
-      <w:r>
-        <w:rPr>
-          <w:rtl/>
-        </w:rPr>
-        <w:t xml:space="preserve">- تحديث مصفوفة الـ</w:t>
+    </w:p>
+    <w:p>
+      <w:pPr>
+        <w:numPr>
+          <w:ilvl w:val="1"/>
+          <w:numId w:val="1014"/>
+        </w:numPr>
+        <w:pStyle w:val="Compact"/>
+        <w:bidi/>
+      </w:pPr>
+      <w:r>
+        <w:rPr>
+          <w:rtl/>
+        </w:rPr>
+        <w:t xml:space="preserve">تحديث مصفوفة الـ</w:t>
       </w:r>
       <w:r>
         <w:rPr>
@@ -6919,17 +7052,21 @@
         </w:rPr>
         <w:t xml:space="preserve">المحفوظة لديه في الذاكرة.</w:t>
       </w:r>
-      <w:r>
-        <w:rPr>
-          <w:rtl/>
-        </w:rPr>
-        <w:t xml:space="preserve"> </w:t>
-      </w:r>
-      <w:r>
-        <w:rPr>
-          <w:rtl/>
-        </w:rPr>
-        <w:t xml:space="preserve">- استدعاء المحرك</w:t>
+    </w:p>
+    <w:p>
+      <w:pPr>
+        <w:numPr>
+          <w:ilvl w:val="1"/>
+          <w:numId w:val="1014"/>
+        </w:numPr>
+        <w:pStyle w:val="Compact"/>
+        <w:bidi/>
+      </w:pPr>
+      <w:r>
+        <w:rPr>
+          <w:rtl/>
+        </w:rPr>
+        <w:t xml:space="preserve">استدعاء المحرك</w:t>
       </w:r>
       <w:r>
         <w:rPr>
@@ -6956,17 +7093,21 @@
         </w:rPr>
         <w:t xml:space="preserve">ليقوم بتوليد جميع ملفات HTML من الصفر بالبيانات الجديدة.</w:t>
       </w:r>
-      <w:r>
-        <w:rPr>
-          <w:rtl/>
-        </w:rPr>
-        <w:t xml:space="preserve"> </w:t>
-      </w:r>
-      <w:r>
-        <w:rPr>
-          <w:rtl/>
-        </w:rPr>
-        <w:t xml:space="preserve">- إعادة توجيه المستخدم لصفحة الـ Index ليرى المنتج الجديد وكأننا استخدمنا قاعدة بيانات حقيقية وإطار فلاسك الحقيقي!</w:t>
+    </w:p>
+    <w:p>
+      <w:pPr>
+        <w:numPr>
+          <w:ilvl w:val="1"/>
+          <w:numId w:val="1014"/>
+        </w:numPr>
+        <w:pStyle w:val="Compact"/>
+        <w:bidi/>
+      </w:pPr>
+      <w:r>
+        <w:rPr>
+          <w:rtl/>
+        </w:rPr>
+        <w:t xml:space="preserve">إعادة توجيه المستخدم لصفحة الـ Index ليرى المنتج الجديد وكأننا استخدمنا قاعدة بيانات حقيقية وإطار فلاسك الحقيقي!</w:t>
       </w:r>
     </w:p>
     <w:p>
@@ -7563,8 +7704,427 @@
       </w:pPr>
     </w:lvl>
   </w:abstractNum>
+  <w:abstractNum w:abstractNumId="991">
+    <w:nsid w:val="A991"/>
+    <w:multiLevelType w:val="multilevel"/>
+    <w:lvl w:ilvl="0">
+      <w:numFmt w:val="bullet"/>
+      <w:lvlText w:val="•"/>
+      <w:lvlJc w:val="left"/>
+      <w:pPr>
+        <w:ind w:left="720" w:hanging="480"/>
+      </w:pPr>
+    </w:lvl>
+    <w:lvl w:ilvl="1">
+      <w:numFmt w:val="bullet"/>
+      <w:lvlText w:val="–"/>
+      <w:lvlJc w:val="left"/>
+      <w:pPr>
+        <w:ind w:left="1440" w:hanging="480"/>
+      </w:pPr>
+    </w:lvl>
+    <w:lvl w:ilvl="2">
+      <w:numFmt w:val="bullet"/>
+      <w:lvlText w:val="•"/>
+      <w:lvlJc w:val="left"/>
+      <w:pPr>
+        <w:ind w:left="2160" w:hanging="480"/>
+      </w:pPr>
+    </w:lvl>
+    <w:lvl w:ilvl="3">
+      <w:numFmt w:val="bullet"/>
+      <w:lvlText w:val="–"/>
+      <w:lvlJc w:val="left"/>
+      <w:pPr>
+        <w:ind w:left="2880" w:hanging="480"/>
+      </w:pPr>
+    </w:lvl>
+    <w:lvl w:ilvl="4">
+      <w:numFmt w:val="bullet"/>
+      <w:lvlText w:val="•"/>
+      <w:lvlJc w:val="left"/>
+      <w:pPr>
+        <w:ind w:left="3600" w:hanging="480"/>
+      </w:pPr>
+    </w:lvl>
+    <w:lvl w:ilvl="5">
+      <w:numFmt w:val="bullet"/>
+      <w:lvlText w:val="–"/>
+      <w:lvlJc w:val="left"/>
+      <w:pPr>
+        <w:ind w:left="4320" w:hanging="480"/>
+      </w:pPr>
+    </w:lvl>
+    <w:lvl w:ilvl="6">
+      <w:numFmt w:val="bullet"/>
+      <w:lvlText w:val="•"/>
+      <w:lvlJc w:val="left"/>
+      <w:pPr>
+        <w:ind w:left="5040" w:hanging="480"/>
+      </w:pPr>
+    </w:lvl>
+    <w:lvl w:ilvl="7">
+      <w:numFmt w:val="bullet"/>
+      <w:lvlText w:val="–"/>
+      <w:lvlJc w:val="left"/>
+      <w:pPr>
+        <w:ind w:left="5760" w:hanging="480"/>
+      </w:pPr>
+    </w:lvl>
+    <w:lvl w:ilvl="8">
+      <w:numFmt w:val="bullet"/>
+      <w:lvlText w:val="•"/>
+      <w:lvlJc w:val="left"/>
+      <w:pPr>
+        <w:ind w:left="6480" w:hanging="480"/>
+      </w:pPr>
+    </w:lvl>
+  </w:abstractNum>
+  <w:abstractNum w:abstractNumId="99411">
+    <w:nsid w:val="A99411"/>
+    <w:multiLevelType w:val="multilevel"/>
+    <w:lvl w:ilvl="0">
+      <w:start w:val="1"/>
+      <w:numFmt w:val="decimal"/>
+      <w:lvlText w:val="%1."/>
+      <w:lvlJc w:val="left"/>
+      <w:pPr>
+        <w:ind w:left="720" w:hanging="480"/>
+      </w:pPr>
+    </w:lvl>
+    <w:lvl w:ilvl="1">
+      <w:start w:val="1"/>
+      <w:numFmt w:val="decimal"/>
+      <w:lvlText w:val="%2."/>
+      <w:lvlJc w:val="left"/>
+      <w:pPr>
+        <w:ind w:left="1440" w:hanging="480"/>
+      </w:pPr>
+    </w:lvl>
+    <w:lvl w:ilvl="2">
+      <w:start w:val="1"/>
+      <w:numFmt w:val="decimal"/>
+      <w:lvlText w:val="%3."/>
+      <w:lvlJc w:val="left"/>
+      <w:pPr>
+        <w:ind w:left="2160" w:hanging="480"/>
+      </w:pPr>
+    </w:lvl>
+    <w:lvl w:ilvl="3">
+      <w:start w:val="1"/>
+      <w:numFmt w:val="decimal"/>
+      <w:lvlText w:val="%4."/>
+      <w:lvlJc w:val="left"/>
+      <w:pPr>
+        <w:ind w:left="2880" w:hanging="480"/>
+      </w:pPr>
+    </w:lvl>
+    <w:lvl w:ilvl="4">
+      <w:start w:val="1"/>
+      <w:numFmt w:val="decimal"/>
+      <w:lvlText w:val="%5."/>
+      <w:lvlJc w:val="left"/>
+      <w:pPr>
+        <w:ind w:left="3600" w:hanging="480"/>
+      </w:pPr>
+    </w:lvl>
+    <w:lvl w:ilvl="5">
+      <w:start w:val="1"/>
+      <w:numFmt w:val="decimal"/>
+      <w:lvlText w:val="%6."/>
+      <w:lvlJc w:val="left"/>
+      <w:pPr>
+        <w:ind w:left="4320" w:hanging="480"/>
+      </w:pPr>
+    </w:lvl>
+    <w:lvl w:ilvl="6">
+      <w:start w:val="1"/>
+      <w:numFmt w:val="decimal"/>
+      <w:lvlText w:val="%7."/>
+      <w:lvlJc w:val="left"/>
+      <w:pPr>
+        <w:ind w:left="5040" w:hanging="480"/>
+      </w:pPr>
+    </w:lvl>
+    <w:lvl w:ilvl="7">
+      <w:start w:val="1"/>
+      <w:numFmt w:val="decimal"/>
+      <w:lvlText w:val="%8."/>
+      <w:lvlJc w:val="left"/>
+      <w:pPr>
+        <w:ind w:left="5760" w:hanging="480"/>
+      </w:pPr>
+    </w:lvl>
+    <w:lvl w:ilvl="8">
+      <w:start w:val="1"/>
+      <w:numFmt w:val="decimal"/>
+      <w:lvlText w:val="%9."/>
+      <w:lvlJc w:val="left"/>
+      <w:pPr>
+        <w:ind w:left="6480" w:hanging="480"/>
+      </w:pPr>
+    </w:lvl>
+  </w:abstractNum>
   <w:num w:numId="1000">
     <w:abstractNumId w:val="990"/>
+  </w:num>
+  <w:num w:numId="1001">
+    <w:abstractNumId w:val="991"/>
+  </w:num>
+  <w:num w:numId="1002">
+    <w:abstractNumId w:val="99411"/>
+    <w:lvlOverride w:ilvl="0">
+      <w:startOverride w:val="1"/>
+    </w:lvlOverride>
+    <w:lvlOverride w:ilvl="1">
+      <w:startOverride w:val="1"/>
+    </w:lvlOverride>
+    <w:lvlOverride w:ilvl="2">
+      <w:startOverride w:val="1"/>
+    </w:lvlOverride>
+    <w:lvlOverride w:ilvl="3">
+      <w:startOverride w:val="1"/>
+    </w:lvlOverride>
+    <w:lvlOverride w:ilvl="4">
+      <w:startOverride w:val="1"/>
+    </w:lvlOverride>
+    <w:lvlOverride w:ilvl="5">
+      <w:startOverride w:val="1"/>
+    </w:lvlOverride>
+    <w:lvlOverride w:ilvl="6">
+      <w:startOverride w:val="1"/>
+    </w:lvlOverride>
+    <w:lvlOverride w:ilvl="7">
+      <w:startOverride w:val="1"/>
+    </w:lvlOverride>
+    <w:lvlOverride w:ilvl="8">
+      <w:startOverride w:val="1"/>
+    </w:lvlOverride>
+  </w:num>
+  <w:num w:numId="1003">
+    <w:abstractNumId w:val="99411"/>
+    <w:lvlOverride w:ilvl="0">
+      <w:startOverride w:val="1"/>
+    </w:lvlOverride>
+    <w:lvlOverride w:ilvl="1">
+      <w:startOverride w:val="1"/>
+    </w:lvlOverride>
+    <w:lvlOverride w:ilvl="2">
+      <w:startOverride w:val="1"/>
+    </w:lvlOverride>
+    <w:lvlOverride w:ilvl="3">
+      <w:startOverride w:val="1"/>
+    </w:lvlOverride>
+    <w:lvlOverride w:ilvl="4">
+      <w:startOverride w:val="1"/>
+    </w:lvlOverride>
+    <w:lvlOverride w:ilvl="5">
+      <w:startOverride w:val="1"/>
+    </w:lvlOverride>
+    <w:lvlOverride w:ilvl="6">
+      <w:startOverride w:val="1"/>
+    </w:lvlOverride>
+    <w:lvlOverride w:ilvl="7">
+      <w:startOverride w:val="1"/>
+    </w:lvlOverride>
+    <w:lvlOverride w:ilvl="8">
+      <w:startOverride w:val="1"/>
+    </w:lvlOverride>
+  </w:num>
+  <w:num w:numId="1004">
+    <w:abstractNumId w:val="991"/>
+  </w:num>
+  <w:num w:numId="1005">
+    <w:abstractNumId w:val="991"/>
+  </w:num>
+  <w:num w:numId="1006">
+    <w:abstractNumId w:val="99411"/>
+    <w:lvlOverride w:ilvl="0">
+      <w:startOverride w:val="1"/>
+    </w:lvlOverride>
+    <w:lvlOverride w:ilvl="1">
+      <w:startOverride w:val="1"/>
+    </w:lvlOverride>
+    <w:lvlOverride w:ilvl="2">
+      <w:startOverride w:val="1"/>
+    </w:lvlOverride>
+    <w:lvlOverride w:ilvl="3">
+      <w:startOverride w:val="1"/>
+    </w:lvlOverride>
+    <w:lvlOverride w:ilvl="4">
+      <w:startOverride w:val="1"/>
+    </w:lvlOverride>
+    <w:lvlOverride w:ilvl="5">
+      <w:startOverride w:val="1"/>
+    </w:lvlOverride>
+    <w:lvlOverride w:ilvl="6">
+      <w:startOverride w:val="1"/>
+    </w:lvlOverride>
+    <w:lvlOverride w:ilvl="7">
+      <w:startOverride w:val="1"/>
+    </w:lvlOverride>
+    <w:lvlOverride w:ilvl="8">
+      <w:startOverride w:val="1"/>
+    </w:lvlOverride>
+  </w:num>
+  <w:num w:numId="1007">
+    <w:abstractNumId w:val="991"/>
+  </w:num>
+  <w:num w:numId="1008">
+    <w:abstractNumId w:val="99411"/>
+    <w:lvlOverride w:ilvl="0">
+      <w:startOverride w:val="1"/>
+    </w:lvlOverride>
+    <w:lvlOverride w:ilvl="1">
+      <w:startOverride w:val="1"/>
+    </w:lvlOverride>
+    <w:lvlOverride w:ilvl="2">
+      <w:startOverride w:val="1"/>
+    </w:lvlOverride>
+    <w:lvlOverride w:ilvl="3">
+      <w:startOverride w:val="1"/>
+    </w:lvlOverride>
+    <w:lvlOverride w:ilvl="4">
+      <w:startOverride w:val="1"/>
+    </w:lvlOverride>
+    <w:lvlOverride w:ilvl="5">
+      <w:startOverride w:val="1"/>
+    </w:lvlOverride>
+    <w:lvlOverride w:ilvl="6">
+      <w:startOverride w:val="1"/>
+    </w:lvlOverride>
+    <w:lvlOverride w:ilvl="7">
+      <w:startOverride w:val="1"/>
+    </w:lvlOverride>
+    <w:lvlOverride w:ilvl="8">
+      <w:startOverride w:val="1"/>
+    </w:lvlOverride>
+  </w:num>
+  <w:num w:numId="1009">
+    <w:abstractNumId w:val="99411"/>
+    <w:lvlOverride w:ilvl="0">
+      <w:startOverride w:val="1"/>
+    </w:lvlOverride>
+    <w:lvlOverride w:ilvl="1">
+      <w:startOverride w:val="1"/>
+    </w:lvlOverride>
+    <w:lvlOverride w:ilvl="2">
+      <w:startOverride w:val="1"/>
+    </w:lvlOverride>
+    <w:lvlOverride w:ilvl="3">
+      <w:startOverride w:val="1"/>
+    </w:lvlOverride>
+    <w:lvlOverride w:ilvl="4">
+      <w:startOverride w:val="1"/>
+    </w:lvlOverride>
+    <w:lvlOverride w:ilvl="5">
+      <w:startOverride w:val="1"/>
+    </w:lvlOverride>
+    <w:lvlOverride w:ilvl="6">
+      <w:startOverride w:val="1"/>
+    </w:lvlOverride>
+    <w:lvlOverride w:ilvl="7">
+      <w:startOverride w:val="1"/>
+    </w:lvlOverride>
+    <w:lvlOverride w:ilvl="8">
+      <w:startOverride w:val="1"/>
+    </w:lvlOverride>
+  </w:num>
+  <w:num w:numId="1010">
+    <w:abstractNumId w:val="99411"/>
+    <w:lvlOverride w:ilvl="0">
+      <w:startOverride w:val="1"/>
+    </w:lvlOverride>
+    <w:lvlOverride w:ilvl="1">
+      <w:startOverride w:val="1"/>
+    </w:lvlOverride>
+    <w:lvlOverride w:ilvl="2">
+      <w:startOverride w:val="1"/>
+    </w:lvlOverride>
+    <w:lvlOverride w:ilvl="3">
+      <w:startOverride w:val="1"/>
+    </w:lvlOverride>
+    <w:lvlOverride w:ilvl="4">
+      <w:startOverride w:val="1"/>
+    </w:lvlOverride>
+    <w:lvlOverride w:ilvl="5">
+      <w:startOverride w:val="1"/>
+    </w:lvlOverride>
+    <w:lvlOverride w:ilvl="6">
+      <w:startOverride w:val="1"/>
+    </w:lvlOverride>
+    <w:lvlOverride w:ilvl="7">
+      <w:startOverride w:val="1"/>
+    </w:lvlOverride>
+    <w:lvlOverride w:ilvl="8">
+      <w:startOverride w:val="1"/>
+    </w:lvlOverride>
+  </w:num>
+  <w:num w:numId="1011">
+    <w:abstractNumId w:val="99411"/>
+    <w:lvlOverride w:ilvl="0">
+      <w:startOverride w:val="1"/>
+    </w:lvlOverride>
+    <w:lvlOverride w:ilvl="1">
+      <w:startOverride w:val="1"/>
+    </w:lvlOverride>
+    <w:lvlOverride w:ilvl="2">
+      <w:startOverride w:val="1"/>
+    </w:lvlOverride>
+    <w:lvlOverride w:ilvl="3">
+      <w:startOverride w:val="1"/>
+    </w:lvlOverride>
+    <w:lvlOverride w:ilvl="4">
+      <w:startOverride w:val="1"/>
+    </w:lvlOverride>
+    <w:lvlOverride w:ilvl="5">
+      <w:startOverride w:val="1"/>
+    </w:lvlOverride>
+    <w:lvlOverride w:ilvl="6">
+      <w:startOverride w:val="1"/>
+    </w:lvlOverride>
+    <w:lvlOverride w:ilvl="7">
+      <w:startOverride w:val="1"/>
+    </w:lvlOverride>
+    <w:lvlOverride w:ilvl="8">
+      <w:startOverride w:val="1"/>
+    </w:lvlOverride>
+  </w:num>
+  <w:num w:numId="1012">
+    <w:abstractNumId w:val="991"/>
+  </w:num>
+  <w:num w:numId="1013">
+    <w:abstractNumId w:val="99411"/>
+    <w:lvlOverride w:ilvl="0">
+      <w:startOverride w:val="1"/>
+    </w:lvlOverride>
+    <w:lvlOverride w:ilvl="1">
+      <w:startOverride w:val="1"/>
+    </w:lvlOverride>
+    <w:lvlOverride w:ilvl="2">
+      <w:startOverride w:val="1"/>
+    </w:lvlOverride>
+    <w:lvlOverride w:ilvl="3">
+      <w:startOverride w:val="1"/>
+    </w:lvlOverride>
+    <w:lvlOverride w:ilvl="4">
+      <w:startOverride w:val="1"/>
+    </w:lvlOverride>
+    <w:lvlOverride w:ilvl="5">
+      <w:startOverride w:val="1"/>
+    </w:lvlOverride>
+    <w:lvlOverride w:ilvl="6">
+      <w:startOverride w:val="1"/>
+    </w:lvlOverride>
+    <w:lvlOverride w:ilvl="7">
+      <w:startOverride w:val="1"/>
+    </w:lvlOverride>
+    <w:lvlOverride w:ilvl="8">
+      <w:startOverride w:val="1"/>
+    </w:lvlOverride>
+  </w:num>
+  <w:num w:numId="1014">
+    <w:abstractNumId w:val="991"/>
   </w:num>
 </w:numbering>
 </file>

</xml_diff>